<commit_message>
chinh sua cac mau thuan ve csdl va storage
</commit_message>
<xml_diff>
--- a/docs/SRS.docx
+++ b/docs/SRS.docx
@@ -5099,7 +5099,19 @@
         <w:rPr>
           <w:rFonts w:ascii="Times New Roman" w:eastAsia="Times New Roman" w:hAnsi="Times New Roman" w:cs="Times New Roman"/>
         </w:rPr>
-        <w:t>Đối với Học viên: full_name (Chuỗi), avatar_url (Chuỗi URL), phone_number (Chuỗi).</w:t>
+        <w:t xml:space="preserve">Đối với Học viên: full_name (Chuỗi), </w:t>
+      </w:r>
+      <w:r>
+        <w:rPr>
+          <w:rFonts w:ascii="Times New Roman" w:eastAsia="Times New Roman" w:hAnsi="Times New Roman" w:cs="Times New Roman"/>
+        </w:rPr>
+        <w:t>avatar_key (Chuỗi)</w:t>
+      </w:r>
+      <w:r>
+        <w:rPr>
+          <w:rFonts w:ascii="Times New Roman" w:eastAsia="Times New Roman" w:hAnsi="Times New Roman" w:cs="Times New Roman"/>
+        </w:rPr>
+        <w:t>, phone_number (Chuỗi).</w:t>
       </w:r>
     </w:p>
     <w:p>
@@ -5307,7 +5319,7 @@
         <w:rPr>
           <w:rFonts w:ascii="Times New Roman" w:eastAsia="Times New Roman" w:hAnsi="Times New Roman" w:cs="Times New Roman"/>
         </w:rPr>
-        <w:t>server_timestamp (Timestamp)</w:t>
+        <w:t>version (Số nguyên monotonic)</w:t>
       </w:r>
       <w:r>
         <w:rPr>
@@ -5368,19 +5380,19 @@
         <w:rPr>
           <w:rFonts w:ascii="Times New Roman" w:eastAsia="Times New Roman" w:hAnsi="Times New Roman" w:cs="Times New Roman"/>
         </w:rPr>
-        <w:t xml:space="preserve">Áp dụng thuật toán Last-Write-Wins (LWW) dựa trên </w:t>
-      </w:r>
-      <w:r>
-        <w:rPr>
-          <w:rFonts w:ascii="Times New Roman" w:eastAsia="Times New Roman" w:hAnsi="Times New Roman" w:cs="Times New Roman"/>
-        </w:rPr>
-        <w:t xml:space="preserve">server_timestamp </w:t>
-      </w:r>
-      <w:r>
-        <w:rPr>
-          <w:rFonts w:ascii="Times New Roman" w:eastAsia="Times New Roman" w:hAnsi="Times New Roman" w:cs="Times New Roman"/>
-        </w:rPr>
-        <w:t>để xử lý xung đột dữ liệu (Conflict Resolution).</w:t>
+        <w:t xml:space="preserve">Áp dụng thuật toán Last-Write-Wins (LWW) </w:t>
+      </w:r>
+      <w:r>
+        <w:rPr>
+          <w:rFonts w:ascii="Times New Roman" w:eastAsia="Times New Roman" w:hAnsi="Times New Roman" w:cs="Times New Roman"/>
+        </w:rPr>
+        <w:t>dựa trên version để xử lý xung đột</w:t>
+      </w:r>
+      <w:r>
+        <w:rPr>
+          <w:rFonts w:ascii="Times New Roman" w:eastAsia="Times New Roman" w:hAnsi="Times New Roman" w:cs="Times New Roman"/>
+        </w:rPr>
+        <w:t xml:space="preserve"> dữ liệu (Conflict Resolution).</w:t>
       </w:r>
     </w:p>
     <w:p>
@@ -5501,7 +5513,31 @@
         <w:rPr>
           <w:rFonts w:ascii="Times New Roman" w:eastAsia="Times New Roman" w:hAnsi="Times New Roman" w:cs="Times New Roman"/>
         </w:rPr>
-        <w:t xml:space="preserve">Dữ liệu đầu vào (Inputs): question_text (Chuỗi), audio_url (Bắt buộc cho Part 1-4), image_url (Part 1 và câu hỏi có hình), options (Mảng 4 phương án A, B, C, D), correct_option (Enum: 'A', 'B', 'C', 'D'), part (1-7), difficulty (Enum: EASY, MEDIUM, HARD), tags (Mảng chuỗi), </w:t>
+        <w:t xml:space="preserve">Dữ liệu đầu vào (Inputs): question_text (Chuỗi), </w:t>
+      </w:r>
+      <w:r>
+        <w:rPr>
+          <w:rFonts w:ascii="Times New Roman" w:eastAsia="Times New Roman" w:hAnsi="Times New Roman" w:cs="Times New Roman"/>
+        </w:rPr>
+        <w:t>audio_key (Bắt buộc cho Part 1-4)</w:t>
+      </w:r>
+      <w:r>
+        <w:rPr>
+          <w:rFonts w:ascii="Times New Roman" w:eastAsia="Times New Roman" w:hAnsi="Times New Roman" w:cs="Times New Roman"/>
+        </w:rPr>
+        <w:t xml:space="preserve">, </w:t>
+      </w:r>
+      <w:r>
+        <w:rPr>
+          <w:rFonts w:ascii="Times New Roman" w:eastAsia="Times New Roman" w:hAnsi="Times New Roman" w:cs="Times New Roman"/>
+        </w:rPr>
+        <w:t>image_key (Part 1 và câu hỏi có hình)</w:t>
+      </w:r>
+      <w:r>
+        <w:rPr>
+          <w:rFonts w:ascii="Times New Roman" w:eastAsia="Times New Roman" w:hAnsi="Times New Roman" w:cs="Times New Roman"/>
+        </w:rPr>
+        <w:t xml:space="preserve">, options (Mảng 4 phương án A, B, C, D), correct_option (Enum: 'A', 'B', 'C', 'D'), part (1-7), difficulty (Enum: EASY, MEDIUM, HARD), tags (Mảng chuỗi), </w:t>
       </w:r>
       <w:r>
         <w:rPr>
@@ -5563,7 +5599,19 @@
         <w:rPr>
           <w:rFonts w:ascii="Times New Roman" w:eastAsia="Times New Roman" w:hAnsi="Times New Roman" w:cs="Times New Roman"/>
         </w:rPr>
-        <w:t>File ghi âm (.mp3, tối đa 5MB) và ảnh (.png/.jpg, tối đa 2MB) tải lên qua S3 Presigned URL trực tiếp từ Client để giải phóng băng thông Gateway.</w:t>
+        <w:t xml:space="preserve">File ghi âm (.mp3, tối đa 5MB) và ảnh </w:t>
+      </w:r>
+      <w:r>
+        <w:rPr>
+          <w:rFonts w:ascii="Times New Roman" w:eastAsia="Times New Roman" w:hAnsi="Times New Roman" w:cs="Times New Roman"/>
+        </w:rPr>
+        <w:t>(.png/.jpg/.webp, tối đa 2MB)</w:t>
+      </w:r>
+      <w:r>
+        <w:rPr>
+          <w:rFonts w:ascii="Times New Roman" w:eastAsia="Times New Roman" w:hAnsi="Times New Roman" w:cs="Times New Roman"/>
+        </w:rPr>
+        <w:t xml:space="preserve"> tải lên qua S3 Presigned URL trực tiếp từ Client để giải phóng băng thông Gateway.</w:t>
       </w:r>
     </w:p>
     <w:p>
@@ -6285,7 +6333,19 @@
         <w:rPr>
           <w:rFonts w:ascii="Times New Roman" w:eastAsia="Times New Roman" w:hAnsi="Times New Roman" w:cs="Times New Roman"/>
         </w:rPr>
-        <w:t>Dữ liệu đầu vào (Inputs): topic_id (UUIDv4), topic_name (Chuỗi), vocabularies (Mảng JSON: [{word, phonetic, definition, example, audio_url, image_url}]).</w:t>
+        <w:t xml:space="preserve">Dữ liệu đầu vào (Inputs): topic_id (UUIDv4), topic_name (Chuỗi), vocabularies (Mảng JSON: [{word, phonetic, definition, </w:t>
+      </w:r>
+      <w:r>
+        <w:rPr>
+          <w:rFonts w:ascii="Times New Roman" w:eastAsia="Times New Roman" w:hAnsi="Times New Roman" w:cs="Times New Roman"/>
+        </w:rPr>
+        <w:t>example, audio_key, image_key</w:t>
+      </w:r>
+      <w:r>
+        <w:rPr>
+          <w:rFonts w:ascii="Times New Roman" w:eastAsia="Times New Roman" w:hAnsi="Times New Roman" w:cs="Times New Roman"/>
+        </w:rPr>
+        <w:t>}]).</w:t>
       </w:r>
     </w:p>
     <w:p>
@@ -6338,7 +6398,13 @@
         <w:rPr>
           <w:rFonts w:ascii="Times New Roman" w:eastAsia="Times New Roman" w:hAnsi="Times New Roman" w:cs="Times New Roman"/>
         </w:rPr>
-        <w:t>File phát âm (.mp3, tối đa 5MB) được lưu trữ trên Object Storage và phát lại qua CDN public; hệ thống kiểm tra link CDN hoạt động hợp lệ trước khi lưu.</w:t>
+        <w:t xml:space="preserve">File phát âm (.mp3, tối đa 5MB) được lưu trữ trên Object Storage và phát lại qua CDN public; </w:t>
+      </w:r>
+      <w:r>
+        <w:rPr>
+          <w:rFonts w:ascii="Times New Roman" w:eastAsia="Times New Roman" w:hAnsi="Times New Roman" w:cs="Times New Roman"/>
+        </w:rPr>
+        <w:t>hệ thống lưu audio_key, kiểm tra object tồn tại; CDN URL chỉ dùng khi phát nội dung.</w:t>
       </w:r>
     </w:p>
     <w:p>
@@ -6517,7 +6583,13 @@
         <w:rPr>
           <w:rFonts w:ascii="Times New Roman" w:eastAsia="Times New Roman" w:hAnsi="Times New Roman" w:cs="Times New Roman"/>
         </w:rPr>
-        <w:t>Mô tả chức năng: Học viên học từ vựng qua Flashcard (áp dụng thuật toán SM-2) và đọc bài giảng ngữ pháp.</w:t>
+        <w:t xml:space="preserve">Mô tả chức năng: </w:t>
+      </w:r>
+      <w:r>
+        <w:rPr>
+          <w:rFonts w:ascii="Times New Roman" w:eastAsia="Times New Roman" w:hAnsi="Times New Roman" w:cs="Times New Roman"/>
+        </w:rPr>
+        <w:t>Học viên học từ vựng qua Flashcard (áp dụng thuật toán SM-2), làm bài trắc nghiệm nhanh 5 câu và đọc bài giảng ngữ pháp.</w:t>
       </w:r>
     </w:p>
     <w:p>
@@ -6776,7 +6848,19 @@
         <w:rPr>
           <w:rFonts w:ascii="Times New Roman" w:eastAsia="Times New Roman" w:hAnsi="Times New Roman" w:cs="Times New Roman"/>
         </w:rPr>
-        <w:t>Dữ liệu đầu ra (Outputs): HTTP 200 (OK) kèm payload: learning_streak_days, vocabularies_learned, grammar_lessons_completed, mock_test_count, score_trend (Mảng tọa độ), predicted_toeic_score (10 - 990), weak_areas (Mảng kỹ năng còn yếu).</w:t>
+        <w:t xml:space="preserve">Dữ liệu đầu ra (Outputs): HTTP 200 (OK) kèm payload: learning_streak_days, vocabularies_learned, grammar_lessons_completed, mock_test_count, score_trend (Mảng tọa độ), predicted_toeic_score (10 - 990), </w:t>
+      </w:r>
+      <w:r>
+        <w:rPr>
+          <w:rFonts w:ascii="Times New Roman" w:eastAsia="Times New Roman" w:hAnsi="Times New Roman" w:cs="Times New Roman"/>
+        </w:rPr>
+        <w:t>weak_areas (Mảng kỹ năng yếu, tổng hợp theo part từ TestSubmittedEvent)</w:t>
+      </w:r>
+      <w:r>
+        <w:rPr>
+          <w:rFonts w:ascii="Times New Roman" w:eastAsia="Times New Roman" w:hAnsi="Times New Roman" w:cs="Times New Roman"/>
+        </w:rPr>
+        <w:t>.</w:t>
       </w:r>
     </w:p>
     <w:p>
@@ -7341,7 +7425,7 @@
         <w:rPr>
           <w:rFonts w:ascii="Times New Roman" w:eastAsia="Times New Roman" w:hAnsi="Times New Roman" w:cs="Times New Roman"/>
         </w:rPr>
-        <w:t>Rate Limiting: API Gateway áp dụng Redis Token Bucket giới hạn tối đa 20 tin nhắn/ngày/user.</w:t>
+        <w:t>Rate Limiting: API Gateway áp dụng Redis Token Bucket (chống lạm dụng) và AI Chatbox Service kiểm tra quota nghiệp vụ trong daily_chat_usage, giới hạn tối đa 20 tin nhắn/ngày/user.</w:t>
       </w:r>
     </w:p>
     <w:p>
@@ -9892,7 +9976,23 @@
                 <w:sz w:val="19"/>
                 <w:szCs w:val="19"/>
               </w:rPr>
-              <w:t>Học viên đã đăng nhập và chưa vượt quá giới hạn số lượt chat miễn phí trong ngày (Rate limit).</w:t>
+              <w:t xml:space="preserve">Học viên đã đăng nhập và chưa vượt quá </w:t>
+            </w:r>
+            <w:r>
+              <w:rPr>
+                <w:rFonts w:ascii="Times New Roman" w:eastAsia="Times New Roman" w:hAnsi="Times New Roman" w:cs="Times New Roman"/>
+                <w:sz w:val="19"/>
+                <w:szCs w:val="19"/>
+              </w:rPr>
+              <w:t>giới hạn số lượt chat trong ngày</w:t>
+            </w:r>
+            <w:r>
+              <w:rPr>
+                <w:rFonts w:ascii="Times New Roman" w:eastAsia="Times New Roman" w:hAnsi="Times New Roman" w:cs="Times New Roman"/>
+                <w:sz w:val="19"/>
+                <w:szCs w:val="19"/>
+              </w:rPr>
+              <w:t xml:space="preserve"> (Rate limit).</w:t>
             </w:r>
           </w:p>
         </w:tc>
@@ -10391,7 +10491,15 @@
                 <w:sz w:val="19"/>
                 <w:szCs w:val="19"/>
               </w:rPr>
-              <w:t>AI Chatbox Service kiểm tra giới hạn lượt dùng trong ngày (Rate Limit) và định dạng lại dữ liệu theo cấu trúc System Prompt, sau đó gọi API của LLM Engine bên ngoài.</w:t>
+              <w:t>AI Chatbox Service kiểm tra quota nghiệp vụ trong daily_chat_usage (Gateway đã giới hạn Redis Token Bucket) và định dạng lại dữ liệu</w:t>
+            </w:r>
+            <w:r>
+              <w:rPr>
+                <w:rFonts w:ascii="Times New Roman" w:eastAsia="Times New Roman" w:hAnsi="Times New Roman" w:cs="Times New Roman"/>
+                <w:sz w:val="19"/>
+                <w:szCs w:val="19"/>
+              </w:rPr>
+              <w:t xml:space="preserve"> theo cấu trúc System Prompt, sau đó gọi API của LLM Engine bên ngoài.</w:t>
             </w:r>
           </w:p>
         </w:tc>
@@ -10772,7 +10880,23 @@
                 <w:sz w:val="19"/>
                 <w:szCs w:val="19"/>
               </w:rPr>
-              <w:t>Học viên đã sử dụng hết số lượt chat miễn phí trong ngày (vượt quá 20 tin nhắn/ngày).</w:t>
+              <w:t xml:space="preserve">Học viên đã sử dụng hết </w:t>
+            </w:r>
+            <w:r>
+              <w:rPr>
+                <w:rFonts w:ascii="Times New Roman" w:eastAsia="Times New Roman" w:hAnsi="Times New Roman" w:cs="Times New Roman"/>
+                <w:sz w:val="19"/>
+                <w:szCs w:val="19"/>
+              </w:rPr>
+              <w:t>số lượt chat trong ngày</w:t>
+            </w:r>
+            <w:r>
+              <w:rPr>
+                <w:rFonts w:ascii="Times New Roman" w:eastAsia="Times New Roman" w:hAnsi="Times New Roman" w:cs="Times New Roman"/>
+                <w:sz w:val="19"/>
+                <w:szCs w:val="19"/>
+              </w:rPr>
+              <w:t xml:space="preserve"> (vượt quá 20 tin nhắn/ngày).</w:t>
             </w:r>
           </w:p>
         </w:tc>
@@ -10827,7 +10951,23 @@
                 <w:sz w:val="19"/>
                 <w:szCs w:val="19"/>
               </w:rPr>
-              <w:t>2. Hiển thị thông báo gợi ý: “Bạn đã dùng hết 20 lượt chat miễn phí hôm nay.</w:t>
+              <w:t xml:space="preserve">2. Hiển thị thông báo gợi ý: “Bạn đã dùng hết </w:t>
+            </w:r>
+            <w:r>
+              <w:rPr>
+                <w:rFonts w:ascii="Times New Roman" w:eastAsia="Times New Roman" w:hAnsi="Times New Roman" w:cs="Times New Roman"/>
+                <w:sz w:val="19"/>
+                <w:szCs w:val="19"/>
+              </w:rPr>
+              <w:t>20 lượt chat trong ngày hôm nay</w:t>
+            </w:r>
+            <w:r>
+              <w:rPr>
+                <w:rFonts w:ascii="Times New Roman" w:eastAsia="Times New Roman" w:hAnsi="Times New Roman" w:cs="Times New Roman"/>
+                <w:sz w:val="19"/>
+                <w:szCs w:val="19"/>
+              </w:rPr>
+              <w:t>.</w:t>
             </w:r>
           </w:p>
         </w:tc>
@@ -11479,7 +11619,25 @@
                 <w:szCs w:val="19"/>
                 <w:lang w:val="vi-VN"/>
               </w:rPr>
-              <w:t>(theo server_timestamp)</w:t>
+              <w:t>(</w:t>
+            </w:r>
+            <w:r>
+              <w:rPr>
+                <w:rFonts w:ascii="Times New Roman" w:eastAsia="Times New Roman" w:hAnsi="Times New Roman" w:cs="Times New Roman"/>
+                <w:sz w:val="19"/>
+                <w:szCs w:val="19"/>
+                <w:lang w:val="vi-VN"/>
+              </w:rPr>
+              <w:t>theo version</w:t>
+            </w:r>
+            <w:r>
+              <w:rPr>
+                <w:rFonts w:ascii="Times New Roman" w:eastAsia="Times New Roman" w:hAnsi="Times New Roman" w:cs="Times New Roman"/>
+                <w:sz w:val="19"/>
+                <w:szCs w:val="19"/>
+                <w:lang w:val="vi-VN"/>
+              </w:rPr>
+              <w:t>)</w:t>
             </w:r>
             <w:r>
               <w:rPr>
@@ -11694,7 +11852,15 @@
                 <w:sz w:val="19"/>
                 <w:szCs w:val="19"/>
               </w:rPr>
-              <w:t>- Tiến độ học từ vựng và ngữ pháp của học viên được đồng nhất hoàn toàn giữa các nền tảng Web và Mobile App.- Bản ghi có mốc thời gian cập nhật mới nhất (Latest timestamp) được áp dụng làm trạng thái chung.</w:t>
+              <w:t xml:space="preserve">- Tiến độ học từ vựng và ngữ pháp của học viên được đồng nhất hoàn toàn giữa các nền tảng Web và Mobile App.- </w:t>
+            </w:r>
+            <w:r>
+              <w:rPr>
+                <w:rFonts w:ascii="Times New Roman" w:eastAsia="Times New Roman" w:hAnsi="Times New Roman" w:cs="Times New Roman"/>
+                <w:sz w:val="19"/>
+                <w:szCs w:val="19"/>
+              </w:rPr>
+              <w:t>Bản ghi có version lớn nhất được áp dụng làm trạng thái chung.</w:t>
             </w:r>
           </w:p>
           <w:p>
@@ -11957,7 +12123,23 @@
                 <w:sz w:val="19"/>
                 <w:szCs w:val="19"/>
               </w:rPr>
-              <w:t>chứa user_id, client_device_id, server_timestamp (tham khảo) và dữ liệu trạng thái mới</w:t>
+              <w:t xml:space="preserve">chứa user_id, client_device_id, </w:t>
+            </w:r>
+            <w:r>
+              <w:rPr>
+                <w:rFonts w:ascii="Times New Roman" w:eastAsia="Times New Roman" w:hAnsi="Times New Roman" w:cs="Times New Roman"/>
+                <w:sz w:val="19"/>
+                <w:szCs w:val="19"/>
+              </w:rPr>
+              <w:t>version (khóa so sánh LWW)</w:t>
+            </w:r>
+            <w:r>
+              <w:rPr>
+                <w:rFonts w:ascii="Times New Roman" w:eastAsia="Times New Roman" w:hAnsi="Times New Roman" w:cs="Times New Roman"/>
+                <w:sz w:val="19"/>
+                <w:szCs w:val="19"/>
+              </w:rPr>
+              <w:t xml:space="preserve"> và dữ liệu trạng thái mới</w:t>
             </w:r>
             <w:r>
               <w:rPr>
@@ -12153,15 +12335,47 @@
                 <w:sz w:val="19"/>
                 <w:szCs w:val="19"/>
               </w:rPr>
-              <w:t>Hệ thống so khớp server_timestamp (do Server cấp, monotonic) của bản ghi gửi lên với trạng thái canonical lưu trên Server Database.</w:t>
-            </w:r>
-            <w:r>
-              <w:rPr>
-                <w:rFonts w:ascii="Times New Roman" w:eastAsia="Times New Roman" w:hAnsi="Times New Roman" w:cs="Times New Roman"/>
-                <w:sz w:val="19"/>
-                <w:szCs w:val="19"/>
-              </w:rPr>
-              <w:t xml:space="preserve"> Phát hiện thời gian gửi lên mới hơn, hệ thống ghi nhận trạng thái mới vào auth_db.user_sync_states.</w:t>
+              <w:t xml:space="preserve">Hệ thống so khớp </w:t>
+            </w:r>
+            <w:r>
+              <w:rPr>
+                <w:rFonts w:ascii="Times New Roman" w:eastAsia="Times New Roman" w:hAnsi="Times New Roman" w:cs="Times New Roman"/>
+                <w:sz w:val="19"/>
+                <w:szCs w:val="19"/>
+              </w:rPr>
+              <w:t>version (do Server cấp, monotonic)</w:t>
+            </w:r>
+            <w:r>
+              <w:rPr>
+                <w:rFonts w:ascii="Times New Roman" w:eastAsia="Times New Roman" w:hAnsi="Times New Roman" w:cs="Times New Roman"/>
+                <w:sz w:val="19"/>
+                <w:szCs w:val="19"/>
+              </w:rPr>
+              <w:t xml:space="preserve"> của bản ghi gửi lên với trạng thái canonical lưu trên Server Database.</w:t>
+            </w:r>
+            <w:r>
+              <w:rPr>
+                <w:rFonts w:ascii="Times New Roman" w:eastAsia="Times New Roman" w:hAnsi="Times New Roman" w:cs="Times New Roman"/>
+                <w:sz w:val="19"/>
+                <w:szCs w:val="19"/>
+              </w:rPr>
+              <w:t xml:space="preserve"> </w:t>
+            </w:r>
+            <w:r>
+              <w:rPr>
+                <w:rFonts w:ascii="Times New Roman" w:eastAsia="Times New Roman" w:hAnsi="Times New Roman" w:cs="Times New Roman"/>
+                <w:sz w:val="19"/>
+                <w:szCs w:val="19"/>
+              </w:rPr>
+              <w:t>Phát hiện version gửi lên mới hơn</w:t>
+            </w:r>
+            <w:r>
+              <w:rPr>
+                <w:rFonts w:ascii="Times New Roman" w:eastAsia="Times New Roman" w:hAnsi="Times New Roman" w:cs="Times New Roman"/>
+                <w:sz w:val="19"/>
+                <w:szCs w:val="19"/>
+              </w:rPr>
+              <w:t>, hệ thống ghi nhận trạng thái mới vào auth_db.user_sync_states.</w:t>
             </w:r>
           </w:p>
         </w:tc>
@@ -13255,7 +13469,15 @@
                 <w:sz w:val="19"/>
                 <w:szCs w:val="19"/>
               </w:rPr>
-              <w:t>, Message Broker (Truyền thông điệp), Cloud Storage Service (Quản lý tệp phương tiện)</w:t>
+              <w:t xml:space="preserve">, Message Broker (Truyền thông điệp), </w:t>
+            </w:r>
+            <w:r>
+              <w:rPr>
+                <w:rFonts w:ascii="Times New Roman" w:eastAsia="Times New Roman" w:hAnsi="Times New Roman" w:cs="Times New Roman"/>
+                <w:sz w:val="19"/>
+                <w:szCs w:val="19"/>
+              </w:rPr>
+              <w:t>Object Storage (MinIO/S3) — hạ tầng</w:t>
             </w:r>
           </w:p>
         </w:tc>
@@ -13320,7 +13542,23 @@
                 <w:sz w:val="19"/>
                 <w:szCs w:val="19"/>
               </w:rPr>
-              <w:t xml:space="preserve">Quản trị viên tiến hành thêm, sửa đổi, hoặc xóa câu hỏi trong hệ thống CMS quản trị. Để tối ưu băng thông API Gateway, các tệp âm thanh nghe (.mp3) và hình ảnh minh họa (.png) được tải trực tiếp lên Cloud Storage (S3/MinIO) thông qua cơ chế Presigned URL. Sau khi ghi nhận dữ liệu câu hỏi thành công, hệ thống sử dụng Transactional Outbox để </w:t>
+              <w:t xml:space="preserve">Quản trị viên tiến hành thêm, sửa đổi, hoặc xóa câu hỏi trong hệ thống CMS quản trị. Để tối ưu băng thông API Gateway, các tệp âm thanh nghe (.mp3) và hình ảnh minh họa (.png) được tải trực tiếp </w:t>
+            </w:r>
+            <w:r>
+              <w:rPr>
+                <w:rFonts w:ascii="Times New Roman" w:eastAsia="Times New Roman" w:hAnsi="Times New Roman" w:cs="Times New Roman"/>
+                <w:sz w:val="19"/>
+                <w:szCs w:val="19"/>
+              </w:rPr>
+              <w:t>lên Object Storage (S3/MinIO)</w:t>
+            </w:r>
+            <w:r>
+              <w:rPr>
+                <w:rFonts w:ascii="Times New Roman" w:eastAsia="Times New Roman" w:hAnsi="Times New Roman" w:cs="Times New Roman"/>
+                <w:sz w:val="19"/>
+                <w:szCs w:val="19"/>
+              </w:rPr>
+              <w:t xml:space="preserve"> thông qua cơ chế Presigned URL. Sau khi ghi nhận dữ liệu câu hỏi thành công, hệ thống sử dụng Transactional Outbox để </w:t>
             </w:r>
             <w:r>
               <w:rPr>
@@ -13544,7 +13782,23 @@
                 <w:sz w:val="19"/>
                 <w:szCs w:val="19"/>
               </w:rPr>
-              <w:t xml:space="preserve">- Bản ghi câu hỏi được cập nhật hoặc thêm mới thành công vào cơ sở dữ liệu quest_db.questions.- Các tệp đa phương tiện được lưu trữ an toàn trên Cloud Storage với đường dẫn tương thích.- Sự kiện đồng bộ QuestionCreatedEvent / QuestionUpdatedEvent được xuất bản thành công lên Message </w:t>
+              <w:t xml:space="preserve">- Bản ghi câu hỏi được cập nhật hoặc thêm mới thành công vào cơ sở dữ liệu quest_db.questions.- Các tệp đa phương tiện được </w:t>
+            </w:r>
+            <w:r>
+              <w:rPr>
+                <w:rFonts w:ascii="Times New Roman" w:eastAsia="Times New Roman" w:hAnsi="Times New Roman" w:cs="Times New Roman"/>
+                <w:sz w:val="19"/>
+                <w:szCs w:val="19"/>
+              </w:rPr>
+              <w:t>lưu trữ an toàn trên Object Storage dưới dạng object key</w:t>
+            </w:r>
+            <w:r>
+              <w:rPr>
+                <w:rFonts w:ascii="Times New Roman" w:eastAsia="Times New Roman" w:hAnsi="Times New Roman" w:cs="Times New Roman"/>
+                <w:sz w:val="19"/>
+                <w:szCs w:val="19"/>
+              </w:rPr>
+              <w:t xml:space="preserve">.- Sự kiện đồng bộ QuestionCreatedEvent / QuestionUpdatedEvent được xuất bản thành công lên Message </w:t>
             </w:r>
             <w:r>
               <w:rPr>
@@ -13910,7 +14164,23 @@
                 <w:sz w:val="19"/>
                 <w:szCs w:val="19"/>
               </w:rPr>
-              <w:t>Question Bank Service gọi API dịch vụ Cloud Storage (S3) để lấy đường dẫn tải tệp trực tiếp (Presigned URL) có thời gian hết hạn ngắn (5 phút), phản hồi về cho Client kèm token bảo mật.</w:t>
+              <w:t xml:space="preserve">Question Bank Service gọi </w:t>
+            </w:r>
+            <w:r>
+              <w:rPr>
+                <w:rFonts w:ascii="Times New Roman" w:eastAsia="Times New Roman" w:hAnsi="Times New Roman" w:cs="Times New Roman"/>
+                <w:sz w:val="19"/>
+                <w:szCs w:val="19"/>
+              </w:rPr>
+              <w:t>API Object Storage (S3/MinIO)</w:t>
+            </w:r>
+            <w:r>
+              <w:rPr>
+                <w:rFonts w:ascii="Times New Roman" w:eastAsia="Times New Roman" w:hAnsi="Times New Roman" w:cs="Times New Roman"/>
+                <w:sz w:val="19"/>
+                <w:szCs w:val="19"/>
+              </w:rPr>
+              <w:t xml:space="preserve"> để lấy đường dẫn tải tệp trực tiếp (Presigned URL) có thời gian hết hạn ngắn (5 phút), phản hồi về cho Client kèm token bảo mật.</w:t>
             </w:r>
           </w:p>
         </w:tc>
@@ -14004,7 +14274,23 @@
                 <w:sz w:val="19"/>
                 <w:szCs w:val="19"/>
               </w:rPr>
-              <w:t>Ứng dụng Client thực hiện gửi yêu cầu HTTP PUT trực tiếp lên Cloud Storage bằng Presigned URL để upload file, nhận mã HTTP 200 (OK) báo upload thành công.</w:t>
+              <w:t xml:space="preserve">Ứng dụng Client thực hiện gửi yêu cầu HTTP PUT trực tiếp </w:t>
+            </w:r>
+            <w:r>
+              <w:rPr>
+                <w:rFonts w:ascii="Times New Roman" w:eastAsia="Times New Roman" w:hAnsi="Times New Roman" w:cs="Times New Roman"/>
+                <w:sz w:val="19"/>
+                <w:szCs w:val="19"/>
+              </w:rPr>
+              <w:t>lên Object Storage bằng Presigned URL</w:t>
+            </w:r>
+            <w:r>
+              <w:rPr>
+                <w:rFonts w:ascii="Times New Roman" w:eastAsia="Times New Roman" w:hAnsi="Times New Roman" w:cs="Times New Roman"/>
+                <w:sz w:val="19"/>
+                <w:szCs w:val="19"/>
+              </w:rPr>
+              <w:t xml:space="preserve"> để upload file, nhận mã HTTP 200 (OK) báo upload thành công.</w:t>
             </w:r>
           </w:p>
         </w:tc>
@@ -14098,7 +14384,23 @@
                 <w:sz w:val="19"/>
                 <w:szCs w:val="19"/>
               </w:rPr>
-              <w:t>Client gửi yêu cầu lưu câu hỏi (chứa thông tin văn bản và các đường dẫn CDN URL của tệp nghe/ảnh vừa upload) lên Question Bank Service.</w:t>
+              <w:t xml:space="preserve">Client gửi yêu cầu lưu câu hỏi (chứa thông tin văn bản và </w:t>
+            </w:r>
+            <w:r>
+              <w:rPr>
+                <w:rFonts w:ascii="Times New Roman" w:eastAsia="Times New Roman" w:hAnsi="Times New Roman" w:cs="Times New Roman"/>
+                <w:sz w:val="19"/>
+                <w:szCs w:val="19"/>
+              </w:rPr>
+              <w:t>các audio_key/image_key của tệp nghe/ảnh vừa upload</w:t>
+            </w:r>
+            <w:r>
+              <w:rPr>
+                <w:rFonts w:ascii="Times New Roman" w:eastAsia="Times New Roman" w:hAnsi="Times New Roman" w:cs="Times New Roman"/>
+                <w:sz w:val="19"/>
+                <w:szCs w:val="19"/>
+              </w:rPr>
+              <w:t>) lên Question Bank Service.</w:t>
             </w:r>
           </w:p>
         </w:tc>
@@ -14645,7 +14947,31 @@
                 <w:sz w:val="19"/>
                 <w:szCs w:val="19"/>
               </w:rPr>
-              <w:t>1. Question Bank Service kích hoạt tiến trình dọn dẹp (Cleanup) tự động xóa tệp đã upload lên Cloud Storage để tránh lác đác rác bộ nhớ.</w:t>
+              <w:t xml:space="preserve">1. Question Bank Service kích hoạt tiến trình dọn dẹp (Cleanup) tự động xóa tệp đã upload </w:t>
+            </w:r>
+            <w:r>
+              <w:rPr>
+                <w:rFonts w:ascii="Times New Roman" w:eastAsia="Times New Roman" w:hAnsi="Times New Roman" w:cs="Times New Roman"/>
+                <w:sz w:val="19"/>
+                <w:szCs w:val="19"/>
+              </w:rPr>
+              <w:t xml:space="preserve">lên Object Storage để </w:t>
+            </w:r>
+            <w:r>
+              <w:rPr>
+                <w:rFonts w:ascii="Times New Roman" w:eastAsia="Times New Roman" w:hAnsi="Times New Roman" w:cs="Times New Roman"/>
+                <w:sz w:val="19"/>
+                <w:szCs w:val="19"/>
+              </w:rPr>
+              <w:t>tránh lãng phí bộ nhớ</w:t>
+            </w:r>
+            <w:r>
+              <w:rPr>
+                <w:rFonts w:ascii="Times New Roman" w:eastAsia="Times New Roman" w:hAnsi="Times New Roman" w:cs="Times New Roman"/>
+                <w:sz w:val="19"/>
+                <w:szCs w:val="19"/>
+              </w:rPr>
+              <w:t>.</w:t>
             </w:r>
           </w:p>
           <w:p>
@@ -15233,7 +15559,15 @@
                 <w:sz w:val="19"/>
                 <w:szCs w:val="19"/>
               </w:rPr>
-              <w:t xml:space="preserve"> Learning &amp; Theory Service (Quản lý từ vựng và tính toán thuật toán lặp lại ngắt quãng), History &amp; Analytics Service (Cập nhật streak học tập), Message Broker (Truyền thông điệp), Cloud Storage Service (Quản lý tệp phát âm .mp3)</w:t>
+              <w:t xml:space="preserve"> Learning &amp; Theory Service (Quản lý từ vựng và tính toán thuật toán lặp lại ngắt quãng), History &amp; Analytics Service (Cập nhật streak học tập), Message Broker (Truyền thông điệp), </w:t>
+            </w:r>
+            <w:r>
+              <w:rPr>
+                <w:rFonts w:ascii="Times New Roman" w:eastAsia="Times New Roman" w:hAnsi="Times New Roman" w:cs="Times New Roman"/>
+                <w:sz w:val="19"/>
+                <w:szCs w:val="19"/>
+              </w:rPr>
+              <w:t>Object Storage (MinIO/S3) — hạ tầng</w:t>
             </w:r>
           </w:p>
         </w:tc>
@@ -15298,7 +15632,23 @@
                 <w:sz w:val="19"/>
                 <w:szCs w:val="19"/>
               </w:rPr>
-              <w:t xml:space="preserve">Học viên tiến hành học từ vựng mới và ôn tập từ cũ theo từng chủ đề thông qua Flashcard thông minh. Hệ thống tự động phát âm giọng đọc chuẩn của từ vựng từ Cloud Storage CDN và hỗ trợ học viên tự đánh giá mức độ ghi nhớ của mình. Dựa trên đánh giá đó, hệ thống áp dụng </w:t>
+              <w:t xml:space="preserve">Học viên tiến hành học từ vựng mới và ôn tập từ cũ theo từng chủ đề thông qua Flashcard thông minh. Hệ thống tự động phát âm giọng đọc chuẩn của từ vựng </w:t>
+            </w:r>
+            <w:r>
+              <w:rPr>
+                <w:rFonts w:ascii="Times New Roman" w:eastAsia="Times New Roman" w:hAnsi="Times New Roman" w:cs="Times New Roman"/>
+                <w:sz w:val="19"/>
+                <w:szCs w:val="19"/>
+              </w:rPr>
+              <w:t>từ Object Storage (CDN)</w:t>
+            </w:r>
+            <w:r>
+              <w:rPr>
+                <w:rFonts w:ascii="Times New Roman" w:eastAsia="Times New Roman" w:hAnsi="Times New Roman" w:cs="Times New Roman"/>
+                <w:sz w:val="19"/>
+                <w:szCs w:val="19"/>
+              </w:rPr>
+              <w:t xml:space="preserve"> và hỗ trợ học viên tự đánh giá mức độ ghi nhớ của mình. Dựa trên đánh giá đó, hệ thống áp dụng </w:t>
             </w:r>
             <w:r>
               <w:rPr>
@@ -15523,7 +15873,23 @@
                 <w:sz w:val="19"/>
                 <w:szCs w:val="19"/>
               </w:rPr>
-              <w:t>- Trạng thái ghi nhớ của từng từ vựng, hệ số Easiness Factor (EF), số lần ôn tập liên tiếp thành công (repetition number), và ngày ôn tập tiếp theo (Interval) được cập nhật chính xác vào cơ sở dữ liệu learning_db.user_progress.- Sự kiện VocabularyLearnedEvent được phát đi giúp History &amp; Analytics Service đồng bộ tăng điểm và streak học tập.- Màn hình hiển thị kết quả học tập và ngày ôn tập tiếp theo của nhóm từ vựng.</w:t>
+              <w:t xml:space="preserve">- Trạng thái ghi nhớ của từng từ vựng, hệ số Easiness Factor (EF), số lần ôn tập liên tiếp thành công (repetition number), và ngày ôn tập tiếp theo (Interval) được cập nhật chính xác vào cơ sở dữ liệu </w:t>
+            </w:r>
+            <w:r>
+              <w:rPr>
+                <w:rFonts w:ascii="Times New Roman" w:eastAsia="Times New Roman" w:hAnsi="Times New Roman" w:cs="Times New Roman"/>
+                <w:sz w:val="19"/>
+                <w:szCs w:val="19"/>
+              </w:rPr>
+              <w:t>learning_db.user_vocabulary_progress</w:t>
+            </w:r>
+            <w:r>
+              <w:rPr>
+                <w:rFonts w:ascii="Times New Roman" w:eastAsia="Times New Roman" w:hAnsi="Times New Roman" w:cs="Times New Roman"/>
+                <w:sz w:val="19"/>
+                <w:szCs w:val="19"/>
+              </w:rPr>
+              <w:t>.- Sự kiện VocabularyLearnedEvent được phát đi giúp History &amp; Analytics Service đồng bộ tăng điểm và streak học tập.- Màn hình hiển thị kết quả học tập và ngày ôn tập tiếp theo của nhóm từ vựng.</w:t>
             </w:r>
           </w:p>
           <w:p>
@@ -15872,7 +16238,23 @@
                 <w:sz w:val="19"/>
                 <w:szCs w:val="19"/>
               </w:rPr>
-              <w:t>Ứng dụng client gửi yêu cầu tải file âm thanh phát âm (.mp3) và phát giọng đọc chuẩn trực tiếp từ CDN của Cloud Storage.</w:t>
+              <w:t xml:space="preserve">Ứng dụng client gửi yêu cầu tải file âm thanh phát âm (.mp3) và phát giọng đọc chuẩn trực tiếp từ </w:t>
+            </w:r>
+            <w:r>
+              <w:rPr>
+                <w:rFonts w:ascii="Times New Roman" w:eastAsia="Times New Roman" w:hAnsi="Times New Roman" w:cs="Times New Roman"/>
+                <w:sz w:val="19"/>
+                <w:szCs w:val="19"/>
+              </w:rPr>
+              <w:t>CDN của Object Storage</w:t>
+            </w:r>
+            <w:r>
+              <w:rPr>
+                <w:rFonts w:ascii="Times New Roman" w:eastAsia="Times New Roman" w:hAnsi="Times New Roman" w:cs="Times New Roman"/>
+                <w:sz w:val="19"/>
+                <w:szCs w:val="19"/>
+              </w:rPr>
+              <w:t>.</w:t>
             </w:r>
           </w:p>
         </w:tc>
@@ -16459,7 +16841,23 @@
                 <w:sz w:val="19"/>
                 <w:szCs w:val="19"/>
               </w:rPr>
-              <w:t>File âm thanh (.mp3) phát âm của từ vựng trên CDN Cloud Storage bị lỗi không thể tải xuống.</w:t>
+              <w:t xml:space="preserve">File âm thanh (.mp3) phát âm của từ vựng </w:t>
+            </w:r>
+            <w:r>
+              <w:rPr>
+                <w:rFonts w:ascii="Times New Roman" w:eastAsia="Times New Roman" w:hAnsi="Times New Roman" w:cs="Times New Roman"/>
+                <w:sz w:val="19"/>
+                <w:szCs w:val="19"/>
+              </w:rPr>
+              <w:t>trên CDN Object Storage</w:t>
+            </w:r>
+            <w:r>
+              <w:rPr>
+                <w:rFonts w:ascii="Times New Roman" w:eastAsia="Times New Roman" w:hAnsi="Times New Roman" w:cs="Times New Roman"/>
+                <w:sz w:val="19"/>
+                <w:szCs w:val="19"/>
+              </w:rPr>
+              <w:t xml:space="preserve"> bị lỗi không thể tải xuống.</w:t>
             </w:r>
           </w:p>
         </w:tc>
@@ -17125,7 +17523,13 @@
         <w:rPr>
           <w:rFonts w:ascii="Times New Roman" w:eastAsia="Times New Roman" w:hAnsi="Times New Roman" w:cs="Times New Roman"/>
         </w:rPr>
-        <w:t>Nếu một dịch vụ (như AI Chatbox Service) bị lỗi hoặc timeout liên tục quá 5 lần trong 30 giây</w:t>
+        <w:t xml:space="preserve">Nếu một dịch vụ (như AI Chatbox Service) bị lỗi hoặc </w:t>
+      </w:r>
+      <w:r>
+        <w:rPr>
+          <w:rFonts w:ascii="Times New Roman" w:eastAsia="Times New Roman" w:hAnsi="Times New Roman" w:cs="Times New Roman"/>
+        </w:rPr>
+        <w:t>timeout (mỗi request tối đa 10 giây) từ 5 lần trở lên trong 30 giây</w:t>
       </w:r>
       <w:r>
         <w:rPr>
@@ -17549,7 +17953,31 @@
         <w:rPr>
           <w:rFonts w:ascii="Times New Roman" w:eastAsia="Times New Roman" w:hAnsi="Times New Roman" w:cs="Times New Roman"/>
         </w:rPr>
-        <w:t xml:space="preserve"> Các API phiên bản mới phải đảm bảo tương thích ngược với các phiên bản Client cũ thông qua kỹ thuật đánh phiên bản API (ví dụ /api/v1/question và /api/v2/question).</w:t>
+        <w:t xml:space="preserve"> Các API phiên bản mới phải đảm bảo tương thích ngược với các phiên bản Client cũ thông qua kỹ thuật đánh phiên bản API (ví dụ </w:t>
+      </w:r>
+      <w:r>
+        <w:rPr>
+          <w:rFonts w:ascii="Times New Roman" w:eastAsia="Times New Roman" w:hAnsi="Times New Roman" w:cs="Times New Roman"/>
+        </w:rPr>
+        <w:t>/api/v1/questions</w:t>
+      </w:r>
+      <w:r>
+        <w:rPr>
+          <w:rFonts w:ascii="Times New Roman" w:eastAsia="Times New Roman" w:hAnsi="Times New Roman" w:cs="Times New Roman"/>
+        </w:rPr>
+        <w:t xml:space="preserve"> và </w:t>
+      </w:r>
+      <w:r>
+        <w:rPr>
+          <w:rFonts w:ascii="Times New Roman" w:eastAsia="Times New Roman" w:hAnsi="Times New Roman" w:cs="Times New Roman"/>
+        </w:rPr>
+        <w:t>/api/v2/questions</w:t>
+      </w:r>
+      <w:r>
+        <w:rPr>
+          <w:rFonts w:ascii="Times New Roman" w:eastAsia="Times New Roman" w:hAnsi="Times New Roman" w:cs="Times New Roman"/>
+        </w:rPr>
+        <w:t>).</w:t>
       </w:r>
     </w:p>
     <w:p>
@@ -19002,7 +19430,23 @@
                 <w:sz w:val="19"/>
                 <w:szCs w:val="19"/>
               </w:rPr>
-              <w:t>2. Sử dụng hệ thống phân tích log tập trung và Jaeger Tracing để theo dõi sự kiện TestSubmittedEvent được xuất bản thành công từ Exam Service và được History &amp; Analytics Service tiêu thụ cập nhật database thành công.</w:t>
+              <w:t xml:space="preserve">2. Sử dụng hệ thống phân tích log tập trung và </w:t>
+            </w:r>
+            <w:r>
+              <w:rPr>
+                <w:rFonts w:ascii="Times New Roman" w:eastAsia="Times New Roman" w:hAnsi="Times New Roman" w:cs="Times New Roman"/>
+                <w:sz w:val="19"/>
+                <w:szCs w:val="19"/>
+              </w:rPr>
+              <w:t>OpenTelemetry (export Jaeger)</w:t>
+            </w:r>
+            <w:r>
+              <w:rPr>
+                <w:rFonts w:ascii="Times New Roman" w:eastAsia="Times New Roman" w:hAnsi="Times New Roman" w:cs="Times New Roman"/>
+                <w:sz w:val="19"/>
+                <w:szCs w:val="19"/>
+              </w:rPr>
+              <w:t xml:space="preserve"> để theo dõi sự kiện TestSubmittedEvent được xuất bản thành công từ Exam Service và được History &amp; Analytics Service tiêu thụ cập nhật database thành công.</w:t>
             </w:r>
           </w:p>
         </w:tc>
@@ -19635,7 +20079,23 @@
                 <w:sz w:val="19"/>
                 <w:szCs w:val="19"/>
               </w:rPr>
-              <w:t>2. Giả lập trạng thái lệch thời gian (mất mạng) giữa thiết bị khách và Server để kiểm chứng thuật toán Last-Write-Wins ghi nhận đúng bản ghi có dấu mốc thời gian (timestamp) lớn nhất vào auth_db.user_sync_states.</w:t>
+              <w:t xml:space="preserve">2. Giả lập trạng thái lệch thời gian (mất mạng) giữa thiết bị khách và Server để kiểm chứng thuật toán Last-Write-Wins ghi nhận đúng bản ghi có </w:t>
+            </w:r>
+            <w:r>
+              <w:rPr>
+                <w:rFonts w:ascii="Times New Roman" w:eastAsia="Times New Roman" w:hAnsi="Times New Roman" w:cs="Times New Roman"/>
+                <w:sz w:val="19"/>
+                <w:szCs w:val="19"/>
+              </w:rPr>
+              <w:t>version lớn nhất</w:t>
+            </w:r>
+            <w:r>
+              <w:rPr>
+                <w:rFonts w:ascii="Times New Roman" w:eastAsia="Times New Roman" w:hAnsi="Times New Roman" w:cs="Times New Roman"/>
+                <w:sz w:val="19"/>
+                <w:szCs w:val="19"/>
+              </w:rPr>
+              <w:t xml:space="preserve"> vào auth_db.user_sync_states.</w:t>
             </w:r>
           </w:p>
         </w:tc>
@@ -20061,7 +20521,23 @@
                 <w:sz w:val="19"/>
                 <w:szCs w:val="19"/>
               </w:rPr>
-              <w:t>2. Kiểm tra tính toàn vẹn dữ liệu trong cơ sở dữ liệu learning_db.user_progress sau khi kết thúc phiên trắc nghiệm 5 câu để đảm bảo điểm số và tiến trình được ghi nhận đầy đủ.</w:t>
+              <w:t xml:space="preserve">2. Kiểm tra tính toàn vẹn dữ liệu trong cơ sở dữ liệu </w:t>
+            </w:r>
+            <w:r>
+              <w:rPr>
+                <w:rFonts w:ascii="Times New Roman" w:eastAsia="Times New Roman" w:hAnsi="Times New Roman" w:cs="Times New Roman"/>
+                <w:sz w:val="19"/>
+                <w:szCs w:val="19"/>
+              </w:rPr>
+              <w:t>learning_db.user_vocabulary_progress</w:t>
+            </w:r>
+            <w:r>
+              <w:rPr>
+                <w:rFonts w:ascii="Times New Roman" w:eastAsia="Times New Roman" w:hAnsi="Times New Roman" w:cs="Times New Roman"/>
+                <w:sz w:val="19"/>
+                <w:szCs w:val="19"/>
+              </w:rPr>
+              <w:t xml:space="preserve"> sau khi kết thúc phiên trắc nghiệm 5 câu để đảm bảo điểm số và tiến trình được ghi nhận đầy đủ.</w:t>
             </w:r>
           </w:p>
         </w:tc>

</xml_diff>